<commit_message>
Schematic Fixed in NO RCP yet
</commit_message>
<xml_diff>
--- a/BILLEE_Rover_Control_Module_V1/PDB_Engineering_Requirements_and_Design_Guide_Rev_H.docx
+++ b/BILLEE_Rover_Control_Module_V1/PDB_Engineering_Requirements_and_Design_Guide_Rev_H.docx
@@ -129,7 +129,7 @@
               <w:rPr>
                 <w:sz w:val="16"/>
               </w:rPr>
-              <w:t>Replaced onboard RP2040/Pico concept with bare RP2350A baseline controller. Updated GPIO allocation, I2C topology, Zephyr bindings, KiCad sheet plan, and LCSC part list. Kept six drivetrain MOSFET branches and split ARM/SCIENCE rails. Removed MCP23017 from baseline.</w:t>
+              <w:t>Established RP2350A baseline controller (QFN-60, on-board). Updated GPIO allocation, I2C topology, Zephyr bindings, KiCad sheet plan, and LCSC part list. Six drivetrain MOSFET branches, split ARM/SCIENCE rails. Removed MCP23017 from baseline.</w:t>
             </w:r>
           </w:p>
         </w:tc>
@@ -8000,7 +8000,7 @@
               <w:rPr>
                 <w:sz w:val="16"/>
               </w:rPr>
-              <w:t>Own commanded states for DRIVE1-6, ARM, SCIENCE, AUX_22. Enforce sequencing and E-stop rules.</w:t>
+              <w:t>Own commanded states for DRIVE1-6, ARM, SCIENCE. Enforce sequencing and E-stop rules.</w:t>
             </w:r>
           </w:p>
         </w:tc>
@@ -8213,59 +8213,45 @@
         <w:spacing w:after="60"/>
       </w:pPr>
       <w:r>
+        <w:rPr/>
         <w:t>Minimum commands:</w:t>
-      </w:r>
-      <w:r>
         <w:br/>
-      </w:r>
-      <w:r>
         <w:br/>
         <w:t>status</w:t>
-      </w:r>
-      <w:r>
         <w:br/>
         <w:t>telemetry</w:t>
-      </w:r>
-      <w:r>
         <w:br/>
         <w:t>rail drive1 on|off</w:t>
-      </w:r>
-      <w:r>
         <w:br/>
         <w:t>rail drive2 on|off</w:t>
-      </w:r>
-      <w:r>
         <w:br/>
         <w:t>rail drive3 on|off</w:t>
-      </w:r>
-      <w:r>
         <w:br/>
         <w:t>rail drive4 on|off</w:t>
-      </w:r>
-      <w:r>
         <w:br/>
         <w:t>rail drive5 on|off</w:t>
-      </w:r>
-      <w:r>
         <w:br/>
         <w:t>rail drive6 on|off</w:t>
-      </w:r>
-      <w:r>
         <w:br/>
         <w:t>rail drive_all on|off</w:t>
-      </w:r>
-      <w:r>
         <w:br/>
         <w:t>rail arm on|off</w:t>
-      </w:r>
-      <w:r>
         <w:br/>
         <w:t>rail science on|off</w:t>
       </w:r>
-      <w:r>
-        <w:br/>
-        <w:t>rail aux22 on|off</w:t>
-      </w:r>
+      <w:r/>
+      <w:r/>
+      <w:r/>
+      <w:r/>
+      <w:r/>
+      <w:r/>
+      <w:r/>
+      <w:r/>
+      <w:r/>
+      <w:r/>
+      <w:r/>
+      <w:r/>
+      <w:r/>
     </w:p>
     <w:p>
       <w:pPr>
@@ -8318,7 +8304,8 @@
         <w:spacing w:after="60"/>
       </w:pPr>
       <w:r>
-        <w:t>Verify E_STOP_NODE high when released and low when pressed.</w:t>
+        <w:rPr/>
+        <w:t>Verify E_STOP_NODE reads LOW by default and whenever the switch is open/released, and HIGH only while the switch is actively held closed.</w:t>
       </w:r>
     </w:p>
     <w:p>
@@ -8327,7 +8314,8 @@
         <w:spacing w:after="60"/>
       </w:pPr>
       <w:r>
-        <w:t>Verify every final enable is forced low when E-stop is pressed.</w:t>
+        <w:rPr/>
+        <w:t>Verify every final enable is forced low whenever the E-stop switch is not actively held closed (released, disconnected, or wiring fault).</w:t>
       </w:r>
     </w:p>
     <w:p>
@@ -8987,7 +8975,8 @@
           </w:tcPr>
           <w:p>
             <w:r>
-              <w:t>I2C address strap collisions</w:t>
+              <w:rPr/>
+              <w:t>I2C address strap collision</w:t>
             </w:r>
           </w:p>
         </w:tc>
@@ -8997,7 +8986,8 @@
           </w:tcPr>
           <w:p>
             <w:r>
-              <w:t>Three collisions found 2026-08-07: DRIVE5 (U32) and ARM (U36) both strap to 0x45; SCIENCE (U37) and DRIVE6 (U33) both strap to 0x4D; two of the three MCP9808 instances (U39, U40) both strap to 0x19. Re-strap U33 (swap A1/A0 -&gt; 0x47), U36 (A1-&gt;SCL, A0-&gt;GND -&gt; 0x4C), and whichever of U39/U40 is ARM_SCI_TEMP (A1-&gt;VDD, A0-&gt;GND -&gt; 0x1A). Not yet fixed in schematic.</w:t>
+              <w:rPr/>
+              <w:t>RESOLVED 2026-08-08. All 9 devices on the sense/temp I2C bus (U6, U12, U14, U27, U31, U32, U33, U36, U37) confirmed via netlist to strap to unique A1/A0 addresses -- no duplicates. Took several attempts (each intermediate fix landed on an address another device already used) before converging -- final state has ARM (U36) at A1-&gt;SCL, A0-&gt;GND.</w:t>
             </w:r>
           </w:p>
         </w:tc>
@@ -9012,7 +9002,8 @@
           </w:tcPr>
           <w:p>
             <w:r>
-              <w:t>LTC7001 VCCUV floating</w:t>
+              <w:rPr/>
+              <w:t>LTC7001 VCCUV pulldown</w:t>
             </w:r>
           </w:p>
         </w:tc>
@@ -9022,7 +9013,8 @@
           </w:tcPr>
           <w:p>
             <w:r>
-              <w:t>Pin 2 (VCCUV) confirmed unconnected on all 8 instances (U11/U13/U26/U28/U29/U30/U34/U35). Per ADI datasheet, tie to GND for the default 3.5V gate-drive UVLO, or use a resistor for a custom threshold -- floating is not a documented valid state. Not yet fixed in schematic.</w:t>
+              <w:rPr/>
+              <w:t>RESOLVED -- correction to a 2026-08-07 review finding. VCCUV (pin 2) is pulled to GND through a 150k resistor on all 8 instances (R91-R98, one per channel): U34/R91, U35/R92, U11/R93, U13/R94, U26/R95, U29/R96, U30/R97, U28/R98. The prior 'floating' finding was a review-tooling error, not a schematic gap.</w:t>
             </w:r>
           </w:p>
         </w:tc>
@@ -9037,6 +9029,7 @@
           </w:tcPr>
           <w:p>
             <w:r>
+              <w:rPr/>
               <w:t>BAS21 reverse-battery ground-protection network</w:t>
             </w:r>
           </w:p>
@@ -9047,7 +9040,8 @@
           </w:tcPr>
           <w:p>
             <w:r>
-              <w:t>New requirement (Section 4): BAS21 diode (+ optional RGND) in the TPS1HA08 cluster's GND return path, per TI's TPS1HA08-Q1 recommended application circuit. Not yet implemented in schematic as of 2026-08-07.</w:t>
+              <w:rPr/>
+              <w:t>RESOLVED 2026-08-07 for logic power. BAS21 diode + 4.7k RGND implemented in each TPS1HA08's own GND return path (D10/R99-&gt;U2, D11/R100-&gt;U5, D12/R101-&gt;U23), per TI's TPS1HA08-Q1 Section 9.1 application circuit. This topology is specific to eFuses and does not cover the drivetrain/arm/science battery inputs -- see the new open item below.</w:t>
             </w:r>
           </w:p>
         </w:tc>
@@ -9062,6 +9056,7 @@
           </w:tcPr>
           <w:p>
             <w:r>
+              <w:rPr/>
               <w:t>Jetson/POE-switch/network-switch output connectors</w:t>
             </w:r>
           </w:p>
@@ -9072,7 +9067,52 @@
           </w:tcPr>
           <w:p>
             <w:r>
-              <w:t>Spec changed from KF301 screw terminals to XT60 (Section 4). A netlist export taken 2026-08-07 still showed U9/U10/U20/U25 with KF301-5.0-2P footprints -- confirm the XT60 change has been saved in the schematic before the next review pass.</w:t>
+              <w:rPr/>
+              <w:t>RESOLVED 2026-08-08. Confirmed via netlist: U9/U10/U20/U25 (KF301) replaced by CN15/CN16/CN17/CN18 (XT60PW-M), correctly routed to +20V_JETSON, +22.2V_POE, and the shared +12V rail (network switch + aux) respectively.</w:t>
+            </w:r>
+          </w:p>
+        </w:tc>
+      </w:tr>
+      <w:tr>
+        <w:tc>
+          <w:tcPr>
+            <w:tcW w:type="dxa" w:w="3109"/>
+          </w:tcPr>
+          <w:p>
+            <w:r>
+              <w:t>Reverse-battery protection -- drivetrain/arm/science</w:t>
+            </w:r>
+          </w:p>
+        </w:tc>
+        <w:tc>
+          <w:tcPr>
+            <w:tcW w:type="dxa" w:w="7619"/>
+          </w:tcPr>
+          <w:p>
+            <w:r>
+              <w:t>New requirement. CN2 (shared drivetrain battery input, Q1-Q6), CN4 (arm, Q7), and CN12 (science, Q8) have no reverse-battery protection -- connector ties directly to each IPT007N06N drain. The BAS21 ground-protection-network approach used for the TPS1HA08 eFuses does not transfer here: it only works because it carries the eFuse's own quiescent current, not load current. These are XT90-rated high-side FET inputs carrying full branch current, so a passive series diode would dissipate significant power at full load. Use an active block (ideal-diode controller + low-RDS(on) series MOSFET, or a self-biased P-FET reverse blocker) once per shared battery input -- one part ahead of CN2 covers all 6 drivetrain channels. Not yet implemented as of 2026-08-08.</w:t>
+            </w:r>
+          </w:p>
+        </w:tc>
+      </w:tr>
+      <w:tr>
+        <w:tc>
+          <w:tcPr>
+            <w:tcW w:type="dxa" w:w="3109"/>
+          </w:tcPr>
+          <w:p>
+            <w:r>
+              <w:t>Unlinked footprints</w:t>
+            </w:r>
+          </w:p>
+        </w:tc>
+        <w:tc>
+          <w:tcPr>
+            <w:tcW w:type="dxa" w:w="7619"/>
+          </w:tcPr>
+          <w:p>
+            <w:r>
+              <w:t>34 passives have no footprint assigned (bulk/bypass caps and inductors across the three LT8612 buck stages on the Logic Subsystem sheet, plus the RP2350 core inductor L1 and the 6 output caps C66-C71 on Subsystem Power Control). D1 (power LED) has a footprint assigned but it doesn't match its symbol's footprint filter category (assigned a generic diode footprint instead of an LED_* one) -- cosmetic, but worth fixing for a clean ERC run. Not yet linked as of 2026-08-08.</w:t>
             </w:r>
           </w:p>
         </w:tc>

</xml_diff>

<commit_message>
Updated reference designators. Schematic Complete
Not including RCP for Drivetrain/Arm/Science
</commit_message>
<xml_diff>
--- a/BILLEE_Rover_Control_Module_V1/PDB_Engineering_Requirements_and_Design_Guide_Rev_H.docx
+++ b/BILLEE_Rover_Control_Module_V1/PDB_Engineering_Requirements_and_Design_Guide_Rev_H.docx
@@ -144,6 +144,9 @@
           </w:tcPr>
           <w:p>
             <w:r>
+              <w:rPr>
+                <w:sz w:val="16"/>
+              </w:rPr>
               <w:t>Rev H</w:t>
             </w:r>
           </w:p>
@@ -154,7 +157,10 @@
           </w:tcPr>
           <w:p>
             <w:r>
-              <w:t>Corrected E-stop architecture to normally-open, fail-safe hold-to-enable topology (status node pulled LOW/disabled by default, pulled HIGH only while the switch is actively closed). Corrected POE/antenna input spec to reflect the actual module's 24V-max input rating (direct feed from 22.2V logic rail, no dedicated 12V regulation needed for that load). Changed Jetson/POE-switch/network-switch outputs from KF301 screw terminals to XT60 connectors. Removed USB ESD protection requirement (USB2 carries data only, no VBUS power delivery; D+/D- already current-limited by 27ohm series resistors). Added TPS1HA08BQPWPRQ1 eFuse to the locked BOM (already implemented in schematic; doc was out of sync). Added BAS21 ground-protection-network diode (per TI's TPS1HA08-Q1 reverse-battery-protection application circuit) as a new requirement. Corrected GPIO map: E_STOP_STATUS is GPIO12 (not GPIO13); DF11 breakout is GPIO13-27. Removed AUX_22_EN and SPARE_EN from the buffer/AND-gate channel plan and reduced SN74LVC08APWR baseline from 3 chips/12 channels to 2 chips/8 channels to match. Standardized on TXS0108EPWR as the GPIO buffer part (resolves prior SN74LVC244APWR/TXS0108EPWR self-contradiction in favor of what's actually built). Removed external gate-source-pulldown requirement on IPT007N06N given LTC7001's internal INP pulldown holds TGDN toward source during startup/undriven conditions (residual case: LTC7001 fully unpowered leaves TGDN high-Z, tracked as an accepted risk in Section 12). Documented OVLO trip point (~32V) as an intentional design margin for a possible future higher-voltage drivetrain battery, not a defect — current 4S pack has no overvoltage trip margin under this setting. Confirmed IPT007N06N/LTC7001 gate-driver supply on the 12V rail and RP2350/USB/QSPI/crystal circuits against datasheets. Logged new open items: three I2C address strap collisions (DRIVE5/ARM at 0x45, SCIENCE/DRIVE6 at 0x4D, two MCP9808 instances at 0x19), LTC7001 VCCUV floating on all 8 channels.</w:t>
+              <w:rPr>
+                <w:sz w:val="16"/>
+              </w:rPr>
+              <w:t>Corrected E-stop architecture to normally-open, fail-safe hold-to-enable topology (status node pulled LOW/disabled by default, pulled HIGH only while the switch is actively closed). Corrected POE/antenna input spec to reflect the actual module's 24V-max input rating (direct feed from 22.2V logic rail, no dedicated 12V regulation needed for that load). Changed Jetson/POE-switch/network-switch outputs from KF301 screw terminals to XT60 connectors. Removed USB ESD protection requirement (USB2 carries data only, no VBUS power delivery; D+/D- already current-limited by 27ohm series resistors). Added TPS1HA08BQPWPRQ1 eFuse to the locked BOM (already implemented in schematic; doc was out of sync). Added BAS21 ground-protection-network diode (per TI's TPS1HA08-Q1 reverse-battery-protection application circuit) as a new requirement. Corrected GPIO map: E_STOP_STATUS is GPIO12 (not GPIO13); DF11 breakout is GPIO13-27. Removed AUX_22_EN and SPARE_EN from the buffer/AND-gate channel plan and reduced SN74LVC08APWR baseline from 3 chips/12 channels to 2 chips/8 channels to match. Standardized on TXS0108EPWR as the GPIO buffer part (resolves prior SN74LVC244APWR/TXS0108EPWR self-contradiction in favor of what's actually built). Removed external gate-source-pulldown requirement on IPT007N06N given LTC7001's internal INP pulldown holds TGDN toward source during startup/undriven conditions (residual case: LTC7001 fully unpowered leaves TGDN high-Z, tracked as an accepted risk in Section 12). Documented OVLO trip point (~32V) as an intentional design margin for a possible future higher-voltage drivetrain battery, not a defect — current 4S pack has no overvoltage trip margin under this setting. Confirmed IPT007N06N/LTC7001 gate-driver supply on the 12V rail and RP2350/USB/QSPI/crystal circuits against datasheets. I2C address strap collisions and the LTC7001 VCCUV finding (the latter a review-tooling error, not a schematic gap) are resolved as of 2026-08-08 -- see Section 12, Open Verification Items, for detail and history.</w:t>
             </w:r>
           </w:p>
         </w:tc>
@@ -1889,6 +1895,9 @@
           </w:tcPr>
           <w:p>
             <w:r>
+              <w:rPr>
+                <w:sz w:val="16"/>
+              </w:rPr>
               <w:t>ABM8-272-T3</w:t>
             </w:r>
           </w:p>
@@ -1899,6 +1908,9 @@
           </w:tcPr>
           <w:p>
             <w:r>
+              <w:rPr>
+                <w:sz w:val="16"/>
+              </w:rPr>
               <w:t>C20625731</w:t>
             </w:r>
           </w:p>
@@ -2132,6 +2144,9 @@
           </w:tcPr>
           <w:p>
             <w:r>
+              <w:rPr>
+                <w:sz w:val="16"/>
+              </w:rPr>
               <w:t>TXS0108EPWR</w:t>
             </w:r>
           </w:p>
@@ -2168,6 +2183,9 @@
           </w:tcPr>
           <w:p>
             <w:r>
+              <w:rPr>
+                <w:sz w:val="16"/>
+              </w:rPr>
               <w:t>1</w:t>
             </w:r>
           </w:p>
@@ -2397,6 +2415,9 @@
               <w:br/>
             </w:r>
             <w:r>
+              <w:rPr>
+                <w:sz w:val="16"/>
+              </w:rPr>
               <w:br/>
               <w:t>Since this mosfet after about ~8v reaches its “peak” current capabilities, you can set the vcc of this to be on the 12v rail output</w:t>
             </w:r>
@@ -2545,7 +2566,7 @@
               <w:rPr>
                 <w:sz w:val="16"/>
               </w:rPr>
-              <w:t>6</w:t>
+              <w:t>8</w:t>
             </w:r>
           </w:p>
         </w:tc>
@@ -2563,7 +2584,7 @@
               <w:rPr>
                 <w:sz w:val="16"/>
               </w:rPr>
-              <w:t>One per drivetrain gate driver</w:t>
+              <w:t>One per LTC7001 gate-driver channel (all 8: Drive1-6, Arm, Science). Anode to GND, cathode to LTC7001 TS pin (Top Source / switch node) -- clamps negative ringing at turn-off per ADI app guidance. Not output or reverse-polarity protection.</w:t>
             </w:r>
           </w:p>
         </w:tc>
@@ -2887,6 +2908,9 @@
           </w:tcPr>
           <w:p>
             <w:r>
+              <w:rPr>
+                <w:sz w:val="16"/>
+              </w:rPr>
               <w:t>3</w:t>
             </w:r>
           </w:p>
@@ -3007,6 +3031,9 @@
           </w:tcPr>
           <w:p>
             <w:r>
+              <w:rPr>
+                <w:sz w:val="16"/>
+              </w:rPr>
               <w:t>4</w:t>
             </w:r>
           </w:p>
@@ -3331,6 +3358,9 @@
           </w:tcPr>
           <w:p>
             <w:r>
+              <w:rPr>
+                <w:sz w:val="16"/>
+              </w:rPr>
               <w:t>Input eFuse</w:t>
             </w:r>
           </w:p>
@@ -3341,6 +3371,9 @@
           </w:tcPr>
           <w:p>
             <w:r>
+              <w:rPr>
+                <w:sz w:val="16"/>
+              </w:rPr>
               <w:t>TPS1HA08BQPWPRQ1</w:t>
             </w:r>
           </w:p>
@@ -3357,6 +3390,9 @@
           </w:tcPr>
           <w:p>
             <w:r>
+              <w:rPr>
+                <w:sz w:val="16"/>
+              </w:rPr>
               <w:t>HTSSOP-16 (PWP)</w:t>
             </w:r>
           </w:p>
@@ -3367,6 +3403,9 @@
           </w:tcPr>
           <w:p>
             <w:r>
+              <w:rPr>
+                <w:sz w:val="16"/>
+              </w:rPr>
               <w:t>3</w:t>
             </w:r>
           </w:p>
@@ -3377,6 +3416,9 @@
           </w:tcPr>
           <w:p>
             <w:r>
+              <w:rPr>
+                <w:sz w:val="16"/>
+              </w:rPr>
               <w:t>One per LT8612 buck input (3.3V/20V/12V rails), fed from the shared post-INA780-sense 22.2V logic node. Already implemented in schematic (U2/U5/U23); added here to sync BOM with as-built design. ILIM left floating -- confirmed acceptable, uses internal default current limit (~80A). SEL1=15k to GND, SNS=1k to GND selects current-sense mode; LATCH=15k to GND selects auto-retry-after-fault.</w:t>
             </w:r>
           </w:p>
@@ -3392,6 +3434,9 @@
           </w:tcPr>
           <w:p>
             <w:r>
+              <w:rPr>
+                <w:sz w:val="16"/>
+              </w:rPr>
               <w:t>Reverse-battery protection diode</w:t>
             </w:r>
           </w:p>
@@ -3402,6 +3447,9 @@
           </w:tcPr>
           <w:p>
             <w:r>
+              <w:rPr>
+                <w:sz w:val="16"/>
+              </w:rPr>
               <w:t>BAS21 (Nexperia)</w:t>
             </w:r>
           </w:p>
@@ -3418,6 +3466,9 @@
           </w:tcPr>
           <w:p>
             <w:r>
+              <w:rPr>
+                <w:sz w:val="16"/>
+              </w:rPr>
               <w:t>SOT-23</w:t>
             </w:r>
           </w:p>
@@ -3428,6 +3479,9 @@
           </w:tcPr>
           <w:p>
             <w:r>
+              <w:rPr>
+                <w:sz w:val="16"/>
+              </w:rPr>
               <w:t>1 (shared)</w:t>
             </w:r>
           </w:p>
@@ -3438,6 +3492,9 @@
           </w:tcPr>
           <w:p>
             <w:r>
+              <w:rPr>
+                <w:sz w:val="16"/>
+              </w:rPr>
               <w:t>Ground-protection-network diode (DGND) for the TPS1HA08 cluster, per TI's TPS1HA08-Q1 recommended application circuit (Section 9.1, Ground Protection Network): placed in series between the TPS1HA08 devices' common GND reference and board GND (NOT in series with VBB), so only the eFuses' own quiescent/control current needs blocking during a reverse-battery event, not the full load current. Multiple high-side switches may share one DGND network -- U2/U5/U23 can share a single BAS21. Add RGND (4.7k-ohm typical, size against IGND abs-max rating) in parallel with DGND if any of the three drives an inductive load. NOTE: device GND will be offset from microcontroller GND by the diode's forward drop when current flows -- confirm all EN/DIA_EN/SNS/ST/SEL1/SEL2/LATCH control-pin interfaces to the RP2350 have adequate RPROT-style series resistance (15k-ohm typical per TI) for this offset. NOT YET IMPLEMENTED IN SCHEMATIC as of 2026-08-07 -- new requirement, see Section 12.</w:t>
             </w:r>
           </w:p>
@@ -5397,6 +5454,9 @@
           </w:tcPr>
           <w:p>
             <w:r>
+              <w:rPr>
+                <w:sz w:val="16"/>
+              </w:rPr>
               <w:t>ESTOP GPIO Monitor (corrected from GPIO13 in Rev G)</w:t>
             </w:r>
           </w:p>
@@ -5425,6 +5485,9 @@
           </w:tcPr>
           <w:p>
             <w:r>
+              <w:rPr>
+                <w:sz w:val="16"/>
+              </w:rPr>
               <w:t>Broken out on DF11 Header</w:t>
             </w:r>
           </w:p>
@@ -5459,6 +5522,9 @@
           </w:tcPr>
           <w:p>
             <w:r>
+              <w:rPr>
+                <w:sz w:val="16"/>
+              </w:rPr>
               <w:t>Broken out on DF11 Header</w:t>
             </w:r>
           </w:p>
@@ -5493,6 +5559,9 @@
           </w:tcPr>
           <w:p>
             <w:r>
+              <w:rPr>
+                <w:sz w:val="16"/>
+              </w:rPr>
               <w:t>Broken out on DF11 Header</w:t>
             </w:r>
           </w:p>
@@ -5527,6 +5596,9 @@
           </w:tcPr>
           <w:p>
             <w:r>
+              <w:rPr>
+                <w:sz w:val="16"/>
+              </w:rPr>
               <w:t>Broken out on DF11 Header</w:t>
             </w:r>
           </w:p>
@@ -5561,6 +5633,9 @@
           </w:tcPr>
           <w:p>
             <w:r>
+              <w:rPr>
+                <w:sz w:val="16"/>
+              </w:rPr>
               <w:t>Broken out on DF11 Header</w:t>
             </w:r>
           </w:p>
@@ -5595,6 +5670,9 @@
           </w:tcPr>
           <w:p>
             <w:r>
+              <w:rPr>
+                <w:sz w:val="16"/>
+              </w:rPr>
               <w:t>Broken out on DF11 Header</w:t>
             </w:r>
           </w:p>
@@ -5629,6 +5707,9 @@
           </w:tcPr>
           <w:p>
             <w:r>
+              <w:rPr>
+                <w:sz w:val="16"/>
+              </w:rPr>
               <w:t>Broken out on DF11 Header</w:t>
             </w:r>
           </w:p>
@@ -5663,6 +5744,9 @@
           </w:tcPr>
           <w:p>
             <w:r>
+              <w:rPr>
+                <w:sz w:val="16"/>
+              </w:rPr>
               <w:t>Broken out on DF11 Header</w:t>
             </w:r>
           </w:p>
@@ -5697,6 +5781,9 @@
           </w:tcPr>
           <w:p>
             <w:r>
+              <w:rPr>
+                <w:sz w:val="16"/>
+              </w:rPr>
               <w:t>Broken out on DF11 Header</w:t>
             </w:r>
           </w:p>
@@ -5731,6 +5818,9 @@
           </w:tcPr>
           <w:p>
             <w:r>
+              <w:rPr>
+                <w:sz w:val="16"/>
+              </w:rPr>
               <w:t>Broken out on DF11 Header</w:t>
             </w:r>
           </w:p>
@@ -5765,6 +5855,9 @@
           </w:tcPr>
           <w:p>
             <w:r>
+              <w:rPr>
+                <w:sz w:val="16"/>
+              </w:rPr>
               <w:t>Broken out on DF11 Header</w:t>
             </w:r>
           </w:p>
@@ -5799,6 +5892,9 @@
           </w:tcPr>
           <w:p>
             <w:r>
+              <w:rPr>
+                <w:sz w:val="16"/>
+              </w:rPr>
               <w:t>Broken out on DF11 Header</w:t>
             </w:r>
           </w:p>
@@ -5833,6 +5929,9 @@
           </w:tcPr>
           <w:p>
             <w:r>
+              <w:rPr>
+                <w:sz w:val="16"/>
+              </w:rPr>
               <w:t>Broken out on DF11 Header</w:t>
             </w:r>
           </w:p>
@@ -5867,6 +5966,9 @@
           </w:tcPr>
           <w:p>
             <w:r>
+              <w:rPr>
+                <w:sz w:val="16"/>
+              </w:rPr>
               <w:t>Broken out on DF11 Header</w:t>
             </w:r>
           </w:p>
@@ -5901,6 +6003,9 @@
           </w:tcPr>
           <w:p>
             <w:r>
+              <w:rPr>
+                <w:sz w:val="16"/>
+              </w:rPr>
               <w:t>Broken out on DF11 Header</w:t>
             </w:r>
           </w:p>
@@ -8929,6 +9034,9 @@
           </w:tcPr>
           <w:p>
             <w:r>
+              <w:rPr>
+                <w:sz w:val="16"/>
+              </w:rPr>
               <w:t>Compare final controller sheet against Raspberry Pi official minimal design and the Bronco Space Lab BLVLink hardware v2.0 reference design before PCB routing.</w:t>
             </w:r>
           </w:p>
@@ -8975,7 +9083,9 @@
           </w:tcPr>
           <w:p>
             <w:r>
-              <w:rPr/>
+              <w:rPr>
+                <w:sz w:val="16"/>
+              </w:rPr>
               <w:t>I2C address strap collision</w:t>
             </w:r>
           </w:p>
@@ -8986,7 +9096,9 @@
           </w:tcPr>
           <w:p>
             <w:r>
-              <w:rPr/>
+              <w:rPr>
+                <w:sz w:val="16"/>
+              </w:rPr>
               <w:t>RESOLVED 2026-08-08. All 9 devices on the sense/temp I2C bus (U6, U12, U14, U27, U31, U32, U33, U36, U37) confirmed via netlist to strap to unique A1/A0 addresses -- no duplicates. Took several attempts (each intermediate fix landed on an address another device already used) before converging -- final state has ARM (U36) at A1-&gt;SCL, A0-&gt;GND.</w:t>
             </w:r>
           </w:p>
@@ -9002,7 +9114,9 @@
           </w:tcPr>
           <w:p>
             <w:r>
-              <w:rPr/>
+              <w:rPr>
+                <w:sz w:val="16"/>
+              </w:rPr>
               <w:t>LTC7001 VCCUV pulldown</w:t>
             </w:r>
           </w:p>
@@ -9013,7 +9127,9 @@
           </w:tcPr>
           <w:p>
             <w:r>
-              <w:rPr/>
+              <w:rPr>
+                <w:sz w:val="16"/>
+              </w:rPr>
               <w:t>RESOLVED -- correction to a 2026-08-07 review finding. VCCUV (pin 2) is pulled to GND through a 150k resistor on all 8 instances (R91-R98, one per channel): U34/R91, U35/R92, U11/R93, U13/R94, U26/R95, U29/R96, U30/R97, U28/R98. The prior 'floating' finding was a review-tooling error, not a schematic gap.</w:t>
             </w:r>
           </w:p>
@@ -9029,7 +9145,9 @@
           </w:tcPr>
           <w:p>
             <w:r>
-              <w:rPr/>
+              <w:rPr>
+                <w:sz w:val="16"/>
+              </w:rPr>
               <w:t>BAS21 reverse-battery ground-protection network</w:t>
             </w:r>
           </w:p>
@@ -9040,7 +9158,9 @@
           </w:tcPr>
           <w:p>
             <w:r>
-              <w:rPr/>
+              <w:rPr>
+                <w:sz w:val="16"/>
+              </w:rPr>
               <w:t>RESOLVED 2026-08-07 for logic power. BAS21 diode + 4.7k RGND implemented in each TPS1HA08's own GND return path (D10/R99-&gt;U2, D11/R100-&gt;U5, D12/R101-&gt;U23), per TI's TPS1HA08-Q1 Section 9.1 application circuit. This topology is specific to eFuses and does not cover the drivetrain/arm/science battery inputs -- see the new open item below.</w:t>
             </w:r>
           </w:p>
@@ -9056,7 +9176,9 @@
           </w:tcPr>
           <w:p>
             <w:r>
-              <w:rPr/>
+              <w:rPr>
+                <w:sz w:val="16"/>
+              </w:rPr>
               <w:t>Jetson/POE-switch/network-switch output connectors</w:t>
             </w:r>
           </w:p>
@@ -9067,7 +9189,9 @@
           </w:tcPr>
           <w:p>
             <w:r>
-              <w:rPr/>
+              <w:rPr>
+                <w:sz w:val="16"/>
+              </w:rPr>
               <w:t>RESOLVED 2026-08-08. Confirmed via netlist: U9/U10/U20/U25 (KF301) replaced by CN15/CN16/CN17/CN18 (XT60PW-M), correctly routed to +20V_JETSON, +22.2V_POE, and the shared +12V rail (network switch + aux) respectively.</w:t>
             </w:r>
           </w:p>
@@ -9080,6 +9204,9 @@
           </w:tcPr>
           <w:p>
             <w:r>
+              <w:rPr>
+                <w:sz w:val="16"/>
+              </w:rPr>
               <w:t>Reverse-battery protection -- drivetrain/arm/science</w:t>
             </w:r>
           </w:p>
@@ -9090,6 +9217,9 @@
           </w:tcPr>
           <w:p>
             <w:r>
+              <w:rPr>
+                <w:sz w:val="16"/>
+              </w:rPr>
               <w:t>New requirement. CN2 (shared drivetrain battery input, Q1-Q6), CN4 (arm, Q7), and CN12 (science, Q8) have no reverse-battery protection -- connector ties directly to each IPT007N06N drain. The BAS21 ground-protection-network approach used for the TPS1HA08 eFuses does not transfer here: it only works because it carries the eFuse's own quiescent current, not load current. These are XT90-rated high-side FET inputs carrying full branch current, so a passive series diode would dissipate significant power at full load. Use an active block (ideal-diode controller + low-RDS(on) series MOSFET, or a self-biased P-FET reverse blocker) once per shared battery input -- one part ahead of CN2 covers all 6 drivetrain channels. Not yet implemented as of 2026-08-08.</w:t>
             </w:r>
           </w:p>
@@ -9102,6 +9232,9 @@
           </w:tcPr>
           <w:p>
             <w:r>
+              <w:rPr>
+                <w:sz w:val="16"/>
+              </w:rPr>
               <w:t>Unlinked footprints</w:t>
             </w:r>
           </w:p>
@@ -9112,7 +9245,66 @@
           </w:tcPr>
           <w:p>
             <w:r>
-              <w:t>34 passives have no footprint assigned (bulk/bypass caps and inductors across the three LT8612 buck stages on the Logic Subsystem sheet, plus the RP2350 core inductor L1 and the 6 output caps C66-C71 on Subsystem Power Control). D1 (power LED) has a footprint assigned but it doesn't match its symbol's footprint filter category (assigned a generic diode footprint instead of an LED_* one) -- cosmetic, but worth fixing for a clean ERC run. Not yet linked as of 2026-08-08.</w:t>
+              <w:rPr>
+                <w:sz w:val="16"/>
+              </w:rPr>
+              <w:t>RESOLVED 2026-08-08. Fresh ERC run: 0 violations, 0 components missing a footprint (259/259 linked). The former D1 LED footprint-category mismatch is also gone -- now LED1, assigned an LED0805 footprint matching its symbol's filter category.</w:t>
+            </w:r>
+          </w:p>
+        </w:tc>
+      </w:tr>
+      <w:tr>
+        <w:tc>
+          <w:tcPr>
+            <w:tcW w:type="dxa" w:w="3109"/>
+          </w:tcPr>
+          <w:p>
+            <w:r>
+              <w:rPr>
+                <w:sz w:val="16"/>
+              </w:rPr>
+              <w:t>LT8612 boost capacitor undersized</w:t>
+            </w:r>
+          </w:p>
+        </w:tc>
+        <w:tc>
+          <w:tcPr>
+            <w:tcW w:type="dxa" w:w="7619"/>
+          </w:tcPr>
+          <w:p>
+            <w:r>
+              <w:rPr>
+                <w:sz w:val="16"/>
+              </w:rPr>
+              <w:t>RESOLVED 2026-08-08. All three LT8612 stages (3.3V logic, 20V Jetson, 12V aux) now use a 0.1uF BST cap, matching the datasheet's typical application circuit. Confirmed via fresh netlist re-derivation (component reference designators were re-annotated by the user between the finding and this check, so stages are identified here by BIAS-pin rail, not by ref).</w:t>
+            </w:r>
+          </w:p>
+        </w:tc>
+      </w:tr>
+      <w:tr>
+        <w:tc>
+          <w:tcPr>
+            <w:tcW w:type="dxa" w:w="3109"/>
+          </w:tcPr>
+          <w:p>
+            <w:r>
+              <w:rPr>
+                <w:sz w:val="16"/>
+              </w:rPr>
+              <w:t>LT8612 soft-start cap on Jetson stage</w:t>
+            </w:r>
+          </w:p>
+        </w:tc>
+        <w:tc>
+          <w:tcPr>
+            <w:tcW w:type="dxa" w:w="7619"/>
+          </w:tcPr>
+          <w:p>
+            <w:r>
+              <w:rPr>
+                <w:sz w:val="16"/>
+              </w:rPr>
+              <w:t>RESOLVED -- confirmed intentional 2026-08-08. The 20V Jetson stage's TR/SS cap (1uF vs 10nF on the 3.3V logic and 12V aux stages) deliberately slows that stage's soft-start: the Jetson load sinks significant current at power-up, and the longer ramp limits inrush. Not a defect or inconsistency.</w:t>
             </w:r>
           </w:p>
         </w:tc>
@@ -9270,6 +9462,9 @@
           </w:tcPr>
           <w:p>
             <w:r>
+              <w:rPr>
+                <w:sz w:val="16"/>
+              </w:rPr>
               <w:t>RP2350 reference design cross-check. Use this repository to compare the custom controller sheet against known RP2350 support circuitry, including MCU schematic structure, USB, flash, crystal, SWD, BOOTSEL/RUN, and KiCad project organization before PCB routing.</w:t>
             </w:r>
           </w:p>
@@ -9502,6 +9697,9 @@
           </w:tcPr>
           <w:p>
             <w:r>
+              <w:rPr>
+                <w:sz w:val="16"/>
+              </w:rPr>
               <w:t>Abracon ABM8-272-T3 listing</w:t>
             </w:r>
           </w:p>
@@ -9512,6 +9710,9 @@
           </w:tcPr>
           <w:p>
             <w:r>
+              <w:rPr>
+                <w:sz w:val="16"/>
+              </w:rPr>
               <w:t>12 MHz crystal selected for RP2350 reference-design-compatible clock circuit; LCSC C20625731.</w:t>
             </w:r>
           </w:p>
@@ -9527,6 +9728,9 @@
           </w:tcPr>
           <w:p>
             <w:r>
+              <w:rPr>
+                <w:sz w:val="16"/>
+              </w:rPr>
               <w:t>TI TPS1HA08-Q1 datasheet</w:t>
             </w:r>
           </w:p>
@@ -9537,6 +9741,9 @@
           </w:tcPr>
           <w:p>
             <w:r>
+              <w:rPr>
+                <w:sz w:val="16"/>
+              </w:rPr>
               <w:t>Smart high-side eFuse ahead of each LT8612 buck input. Ground-protection-network application circuit (Section 9.1) is the basis for the BAS21 reverse-battery-protection requirement.</w:t>
             </w:r>
           </w:p>
@@ -9552,6 +9759,9 @@
           </w:tcPr>
           <w:p>
             <w:r>
+              <w:rPr>
+                <w:sz w:val="16"/>
+              </w:rPr>
               <w:t>Nexperia BAS21 datasheet</w:t>
             </w:r>
           </w:p>
@@ -9562,6 +9772,9 @@
           </w:tcPr>
           <w:p>
             <w:r>
+              <w:rPr>
+                <w:sz w:val="16"/>
+              </w:rPr>
               <w:t>Small-signal switching diode used as DGND in the TPS1HA08 ground-protection network.</w:t>
             </w:r>
           </w:p>
@@ -9620,7 +9833,49 @@
       <w:rPr>
         <w:sz w:val="16"/>
       </w:rPr>
-      <w:t>PDB Engineering Requirements and Design Guide - Rev G</w:t>
+      <w:t xml:space="preserve">PDB Engineering Requirements and Design Guide -- Rev H   |   Page </w:t>
+    </w:r>
+    <w:r>
+      <w:rPr>
+        <w:sz w:val="16"/>
+      </w:rPr>
+      <w:fldChar w:fldCharType="begin"/>
+    </w:r>
+    <w:r>
+      <w:rPr>
+        <w:sz w:val="16"/>
+      </w:rPr>
+      <w:instrText xml:space="preserve">PAGE</w:instrText>
+    </w:r>
+    <w:r>
+      <w:rPr>
+        <w:sz w:val="16"/>
+      </w:rPr>
+      <w:fldChar w:fldCharType="end"/>
+    </w:r>
+    <w:r>
+      <w:rPr>
+        <w:sz w:val="16"/>
+      </w:rPr>
+      <w:t xml:space="preserve"> of </w:t>
+    </w:r>
+    <w:r>
+      <w:rPr>
+        <w:sz w:val="16"/>
+      </w:rPr>
+      <w:fldChar w:fldCharType="begin"/>
+    </w:r>
+    <w:r>
+      <w:rPr>
+        <w:sz w:val="16"/>
+      </w:rPr>
+      <w:instrText xml:space="preserve">NUMPAGES</w:instrText>
+    </w:r>
+    <w:r>
+      <w:rPr>
+        <w:sz w:val="16"/>
+      </w:rPr>
+      <w:fldChar w:fldCharType="end"/>
     </w:r>
   </w:p>
 </w:ftr>
@@ -10264,7 +10519,7 @@
       <w:outlineLvl w:val="0"/>
     </w:pPr>
     <w:rPr>
-      <w:rFonts w:asciiTheme="majorHAnsi" w:eastAsiaTheme="majorEastAsia" w:hAnsiTheme="majorHAnsi" w:cstheme="majorBidi"/>
+      <w:rFonts w:asciiTheme="majorHAnsi" w:eastAsiaTheme="majorEastAsia" w:hAnsiTheme="majorHAnsi" w:cstheme="majorBidi" w:ascii="Aptos Display" w:hAnsi="Aptos Display" w:eastAsia="Aptos Display"/>
       <w:b/>
       <w:bCs/>
       <w:color w:val="365F91" w:themeColor="accent1" w:themeShade="BF"/>
@@ -10288,7 +10543,7 @@
       <w:outlineLvl w:val="1"/>
     </w:pPr>
     <w:rPr>
-      <w:rFonts w:asciiTheme="majorHAnsi" w:eastAsiaTheme="majorEastAsia" w:hAnsiTheme="majorHAnsi" w:cstheme="majorBidi"/>
+      <w:rFonts w:asciiTheme="majorHAnsi" w:eastAsiaTheme="majorEastAsia" w:hAnsiTheme="majorHAnsi" w:cstheme="majorBidi" w:ascii="Aptos Display" w:hAnsi="Aptos Display" w:eastAsia="Aptos Display"/>
       <w:b/>
       <w:bCs/>
       <w:color w:val="4F81BD" w:themeColor="accent1"/>
@@ -10312,7 +10567,7 @@
       <w:outlineLvl w:val="2"/>
     </w:pPr>
     <w:rPr>
-      <w:rFonts w:asciiTheme="majorHAnsi" w:eastAsiaTheme="majorEastAsia" w:hAnsiTheme="majorHAnsi" w:cstheme="majorBidi"/>
+      <w:rFonts w:asciiTheme="majorHAnsi" w:eastAsiaTheme="majorEastAsia" w:hAnsiTheme="majorHAnsi" w:cstheme="majorBidi" w:ascii="Aptos Display" w:hAnsi="Aptos Display" w:eastAsia="Aptos Display"/>
       <w:b/>
       <w:bCs/>
       <w:color w:val="4F81BD" w:themeColor="accent1"/>
@@ -10598,7 +10853,7 @@
       <w:contextualSpacing/>
     </w:pPr>
     <w:rPr>
-      <w:rFonts w:asciiTheme="majorHAnsi" w:eastAsiaTheme="majorEastAsia" w:hAnsiTheme="majorHAnsi" w:cstheme="majorBidi"/>
+      <w:rFonts w:asciiTheme="majorHAnsi" w:eastAsiaTheme="majorEastAsia" w:hAnsiTheme="majorHAnsi" w:cstheme="majorBidi" w:ascii="Aptos Display" w:hAnsi="Aptos Display" w:eastAsia="Aptos Display"/>
       <w:color w:val="17365D" w:themeColor="text2" w:themeShade="BF"/>
       <w:spacing w:val="5"/>
       <w:kern w:val="28"/>
@@ -10635,7 +10890,7 @@
       </w:numPr>
     </w:pPr>
     <w:rPr>
-      <w:rFonts w:asciiTheme="majorHAnsi" w:eastAsiaTheme="majorEastAsia" w:hAnsiTheme="majorHAnsi" w:cstheme="majorBidi"/>
+      <w:rFonts w:asciiTheme="majorHAnsi" w:eastAsiaTheme="majorEastAsia" w:hAnsiTheme="majorHAnsi" w:cstheme="majorBidi" w:ascii="Aptos Display" w:hAnsi="Aptos Display" w:eastAsia="Aptos Display"/>
       <w:i/>
       <w:iCs/>
       <w:color w:val="4F81BD" w:themeColor="accent1"/>

</xml_diff>

<commit_message>
Routing complete I think
</commit_message>
<xml_diff>
--- a/BILLEE_Rover_Control_Module_V1/PDB_Engineering_Requirements_and_Design_Guide_Rev_H.docx
+++ b/BILLEE_Rover_Control_Module_V1/PDB_Engineering_Requirements_and_Design_Guide_Rev_H.docx
@@ -12,14 +12,7 @@
           <w:b/>
           <w:sz w:val="40"/>
         </w:rPr>
-        <w:t xml:space="preserve">BILLEE RCM </w:t>
-      </w:r>
-      <w:r>
-        <w:rPr>
-          <w:b/>
-          <w:sz w:val="40"/>
-        </w:rPr>
-        <w:t>Power Distribution Board</w:t>
+        <w:t>BILLEE RCM Power Distribution Board</w:t>
       </w:r>
     </w:p>
     <w:p>
@@ -126,7 +119,35 @@
               <w:rPr>
                 <w:sz w:val="16"/>
               </w:rPr>
-              <w:t>Established RP2350A baseline controller (QFN-60, on-board). Updated GPIO allocation, I2C topology, Zephyr bindings, KiCad sheet plan, and LCSC part list. Six drivetrain MOSFET branches, split ARM/SCIENCE rails. Removed MCP23017 from baseline.</w:t>
+              <w:t xml:space="preserve">Established RP2350A baseline controller (QFN-60, on-board). Updated GPIO allocation, I2C topology, Zephyr bindings, </w:t>
+            </w:r>
+            <w:proofErr w:type="spellStart"/>
+            <w:r>
+              <w:rPr>
+                <w:sz w:val="16"/>
+              </w:rPr>
+              <w:t>KiCad</w:t>
+            </w:r>
+            <w:proofErr w:type="spellEnd"/>
+            <w:r>
+              <w:rPr>
+                <w:sz w:val="16"/>
+              </w:rPr>
+              <w:t xml:space="preserve"> sheet plan, and LCSC part list. Six drivetrain MOSFET </w:t>
+            </w:r>
+            <w:proofErr w:type="gramStart"/>
+            <w:r>
+              <w:rPr>
+                <w:sz w:val="16"/>
+              </w:rPr>
+              <w:t>branches,</w:t>
+            </w:r>
+            <w:proofErr w:type="gramEnd"/>
+            <w:r>
+              <w:rPr>
+                <w:sz w:val="16"/>
+              </w:rPr>
+              <w:t xml:space="preserve"> split ARM/SCIENCE rails. Removed MCP23017 from baseline.</w:t>
             </w:r>
           </w:p>
         </w:tc>
@@ -157,7 +178,49 @@
               <w:rPr>
                 <w:sz w:val="16"/>
               </w:rPr>
-              <w:t>Corrected E-stop architecture to normally-open, fail-safe hold-to-enable topology (status node pulled LOW/disabled by default, pulled HIGH only while the switch is actively closed). Corrected POE/antenna input spec to reflect the actual module's 24V-max input rating (direct feed from 22.2V logic rail, no dedicated 12V regulation needed for that load). Changed Jetson/POE-switch/network-switch outputs from KF301 screw terminals to XT60 connectors. Removed USB ESD protection requirement (USB2 carries data only, no VBUS power delivery; D+/D- already current-limited by 27ohm series resistors). Added TPS1HA08BQPWPRQ1 eFuse to the locked BOM (already implemented in schematic; doc was out of sync). Added BAS21 ground-protection-network diode (per TI's TPS1HA08-Q1 reverse-battery-protection application circuit) as a new requirement. Corrected GPIO map: E_STOP_STATUS is GPIO12 (not GPIO13); DF11 breakout is GPIO13-27. Removed AUX_22_EN and SPARE_EN from the buffer/AND-gate channel plan and reduced SN74LVC08APWR baseline from 3 chips/12 channels to 2 chips/8 channels to match. Standardized on TXS0108EPWR as the GPIO buffer part (resolves prior SN74LVC244APWR/TXS0108EPWR self-contradiction in favor of what's actually built). Removed external gate-source-pulldown requirement on IPT007N06N given LTC7001's internal INP pulldown holds TGDN toward source during startup/undriven conditions (residual case: LTC7001 fully unpowered leaves TGDN high-Z, tracked as an accepted risk in Section 12). Documented OVLO trip point (~32V) as an intentional design margin for a possible future higher-voltage drivetrain battery, not a defect — current 4S pack has no overvoltage trip margin under this setting. Confirmed IPT007N06N/LTC7001 gate-driver supply on the 12V rail and RP2350/USB/QSPI/crystal circuits against datasheets. I2C address strap collisions and the LTC7001 VCCUV finding (the latter a review-tooling error, not a schematic gap) are resolved as of 2026-08-08 -- see Section 12, Open Verification Items, for detail and history.</w:t>
+              <w:t xml:space="preserve">Corrected E-stop architecture to </w:t>
+            </w:r>
+            <w:proofErr w:type="gramStart"/>
+            <w:r>
+              <w:rPr>
+                <w:sz w:val="16"/>
+              </w:rPr>
+              <w:t>normally-open</w:t>
+            </w:r>
+            <w:proofErr w:type="gramEnd"/>
+            <w:r>
+              <w:rPr>
+                <w:sz w:val="16"/>
+              </w:rPr>
+              <w:t xml:space="preserve">, fail-safe hold-to-enable topology (status node pulled LOW/disabled by default, pulled HIGH only while the switch is actively closed). Corrected POE/antenna input spec to reflect the actual module's 24V-max input rating (direct feed from 22.2V logic rail, no dedicated 12V regulation needed for that load). Changed Jetson/POE-switch/network-switch outputs from KF301 screw terminals to XT60 connectors. Removed USB ESD protection requirement (USB2 carries data only, no VBUS power delivery; D+/D- already current-limited by 27ohm series resistors). Added TPS1HA08BQPWPRQ1 </w:t>
+            </w:r>
+            <w:proofErr w:type="spellStart"/>
+            <w:r>
+              <w:rPr>
+                <w:sz w:val="16"/>
+              </w:rPr>
+              <w:t>eFuse</w:t>
+            </w:r>
+            <w:proofErr w:type="spellEnd"/>
+            <w:r>
+              <w:rPr>
+                <w:sz w:val="16"/>
+              </w:rPr>
+              <w:t xml:space="preserve"> to the locked BOM (already implemented in schematic; doc was out of sync). Added BAS21 ground-protection-network diode (per TI's TPS1HA08-Q1 reverse-battery-protection application circuit) as a new requirement. Corrected GPIO map: E_STOP_STATUS is GPIO12 (not GPIO13); DF11 breakout is GPIO13-27. Removed AUX_22_EN and SPARE_EN from the buffer/AND-gate channel plan and reduced SN74LVC08APWR baseline from 3 chips/12 channels to 2 chips/8 channels to match. Standardized on TXS0108EPWR as the GPIO buffer part (resolves prior SN74LVC244APWR/TXS0108EPWR self-contradiction in favor of what's </w:t>
+            </w:r>
+            <w:proofErr w:type="gramStart"/>
+            <w:r>
+              <w:rPr>
+                <w:sz w:val="16"/>
+              </w:rPr>
+              <w:t>actually built</w:t>
+            </w:r>
+            <w:proofErr w:type="gramEnd"/>
+            <w:r>
+              <w:rPr>
+                <w:sz w:val="16"/>
+              </w:rPr>
+              <w:t>). Removed external gate-source-pulldown requirement on IPT007N06N given LTC7001's internal INP pulldown holds TGDN toward source during startup/undriven conditions (residual case: LTC7001 fully unpowered leaves TGDN high-Z, tracked as an accepted risk in Section 12). Documented OVLO trip point (~32V) as an intentional design margin for a possible future higher-voltage drivetrain battery, not a defect — current 4S pack has no overvoltage trip margin under this setting. Confirmed IPT007N06N/LTC7001 gate-driver supply on the 12V rail and RP2350/USB/QSPI/crystal circuits against datasheets. I2C address strap collisions and the LTC7001 VCCUV finding (the latter a review-tooling error, not a schematic gap) are resolved as of 2026-08-08 -- see Section 12, Open Verification Items, for detail and history.</w:t>
             </w:r>
           </w:p>
         </w:tc>
@@ -246,7 +309,15 @@
         <w:spacing w:after="60"/>
       </w:pPr>
       <w:r>
-        <w:t>8. KiCad Schematic Sheet Plan</w:t>
+        <w:t xml:space="preserve">8. </w:t>
+      </w:r>
+      <w:proofErr w:type="spellStart"/>
+      <w:r>
+        <w:t>KiCad</w:t>
+      </w:r>
+      <w:proofErr w:type="spellEnd"/>
+      <w:r>
+        <w:t xml:space="preserve"> Schematic Sheet Plan</w:t>
       </w:r>
     </w:p>
     <w:p>
@@ -312,8 +383,13 @@
         <w:t xml:space="preserve">Use Sections 2 and 3 to </w:t>
       </w:r>
       <w:r>
-        <w:t>learn the architecture</w:t>
-      </w:r>
+        <w:t xml:space="preserve">learn </w:t>
+      </w:r>
+      <w:proofErr w:type="gramStart"/>
+      <w:r>
+        <w:t>the architecture</w:t>
+      </w:r>
+      <w:proofErr w:type="gramEnd"/>
     </w:p>
     <w:p>
       <w:pPr>
@@ -390,7 +466,15 @@
         <w:spacing w:after="60"/>
       </w:pPr>
       <w:r>
-        <w:t>The schematic shall follow the Raspberry Pi RP2350 hardware design guide and the Bronco Space Lab BLVLink hardware v2.0 reference design for RP2350 support circuitry.</w:t>
+        <w:t xml:space="preserve">The schematic shall follow the Raspberry Pi RP2350 hardware design guide and the Bronco Space Lab </w:t>
+      </w:r>
+      <w:proofErr w:type="spellStart"/>
+      <w:r>
+        <w:t>BLVLink</w:t>
+      </w:r>
+      <w:proofErr w:type="spellEnd"/>
+      <w:r>
+        <w:t xml:space="preserve"> hardware v2.0 reference design for RP2350 support circuitry.</w:t>
       </w:r>
     </w:p>
     <w:p>
@@ -777,7 +861,6 @@
         <w:spacing w:after="60"/>
       </w:pPr>
       <w:r>
-        <w:rPr/>
         <w:t>The aux output shall be a 12 V, always-on regulator output shared with the network switch (not individually RP2350-controlled or E-stop-gated, and not INA780x-monitored -- AUX_22_EN was removed from the buffer/AND-gate baseline; see Section 6.3).</w:t>
       </w:r>
     </w:p>
@@ -787,7 +870,15 @@
         <w:spacing w:after="60"/>
       </w:pPr>
       <w:r>
-        <w:t>The RP2350 shall be powered from onboard housekeeping power, not from Jetson USB.</w:t>
+        <w:t xml:space="preserve">The RP2350 </w:t>
+      </w:r>
+      <w:proofErr w:type="gramStart"/>
+      <w:r>
+        <w:t>shall</w:t>
+      </w:r>
+      <w:proofErr w:type="gramEnd"/>
+      <w:r>
+        <w:t xml:space="preserve"> be powered from onboard housekeeping power, not from Jetson USB.</w:t>
       </w:r>
       <w:r>
         <w:t xml:space="preserve"> Jetson USB is just for serial connection.</w:t>
@@ -835,7 +926,15 @@
         <w:spacing w:after="60"/>
       </w:pPr>
       <w:r>
-        <w:t>Each drivetrain branch shall have one dedicated native RP2350 DRIVE_EN_x GPIO.</w:t>
+        <w:t xml:space="preserve">Each drivetrain branch shall have one dedicated native RP2350 </w:t>
+      </w:r>
+      <w:proofErr w:type="spellStart"/>
+      <w:r>
+        <w:t>DRIVE_EN_x</w:t>
+      </w:r>
+      <w:proofErr w:type="spellEnd"/>
+      <w:r>
+        <w:t xml:space="preserve"> GPIO.</w:t>
       </w:r>
     </w:p>
     <w:p>
@@ -844,7 +943,15 @@
         <w:spacing w:after="60"/>
       </w:pPr>
       <w:r>
-        <w:t>Each DRIVE_EN_x signal shall pass through the GPIO buffer and E-stop gate before reaching the gate-driver input.</w:t>
+        <w:t xml:space="preserve">Each </w:t>
+      </w:r>
+      <w:proofErr w:type="spellStart"/>
+      <w:r>
+        <w:t>DRIVE_EN_x</w:t>
+      </w:r>
+      <w:proofErr w:type="spellEnd"/>
+      <w:r>
+        <w:t xml:space="preserve"> signal shall pass through the GPIO buffer and E-stop gate before reaching the gate-driver input.</w:t>
       </w:r>
     </w:p>
     <w:p>
@@ -862,7 +969,13 @@
         <w:spacing w:after="60"/>
       </w:pPr>
       <w:r>
-        <w:t>Each drivetrain branch output shall use a vertical through-hole XT60 connector facing up.</w:t>
+        <w:t xml:space="preserve">Each drivetrain branch output shall use a </w:t>
+      </w:r>
+      <w:r>
+        <w:t>horizontal</w:t>
+      </w:r>
+      <w:r>
+        <w:t xml:space="preserve"> through-hole XT60 connector facing up.</w:t>
       </w:r>
     </w:p>
     <w:p>
@@ -1046,7 +1159,15 @@
         <w:spacing w:after="60"/>
       </w:pPr>
       <w:r>
-        <w:t>The GPIO buffer and AND gates shall be powered from the 3.3 V housekeeping rail.</w:t>
+        <w:t xml:space="preserve">The GPIO buffer and </w:t>
+      </w:r>
+      <w:proofErr w:type="spellStart"/>
+      <w:r>
+        <w:t>AND</w:t>
+      </w:r>
+      <w:proofErr w:type="spellEnd"/>
+      <w:r>
+        <w:t xml:space="preserve"> gates shall be powered from the 3.3 V housekeeping rail.</w:t>
       </w:r>
     </w:p>
     <w:p>
@@ -1152,27 +1273,63 @@
       </w:r>
       <w:r>
         <w:br/>
-        <w:t>|   |-- DRIVE branch 1: gate driver -&gt; IPT007N06N -&gt; INA780x -&gt; vertical XT60</w:t>
+        <w:t xml:space="preserve">|   |-- DRIVE branch 1: gate driver -&gt; IPT007N06N -&gt; INA780x -&gt; </w:t>
+      </w:r>
+      <w:r>
+        <w:t>horizontal</w:t>
+      </w:r>
+      <w:r>
+        <w:t xml:space="preserve"> XT60</w:t>
       </w:r>
       <w:r>
         <w:br/>
-        <w:t>|   |-- DRIVE branch 2: gate driver -&gt; IPT007N06N -&gt; INA780x -&gt; vertical XT60</w:t>
+        <w:t xml:space="preserve">|   |-- DRIVE branch 2: gate driver -&gt; IPT007N06N -&gt; INA780x -&gt; </w:t>
+      </w:r>
+      <w:r>
+        <w:t>horizontal</w:t>
+      </w:r>
+      <w:r>
+        <w:t xml:space="preserve"> XT60</w:t>
       </w:r>
       <w:r>
         <w:br/>
-        <w:t>|   |-- DRIVE branch 3: gate driver -&gt; IPT007N06N -&gt; INA780x -&gt; vertical XT60</w:t>
+        <w:t xml:space="preserve">|   |-- DRIVE branch 3: gate driver -&gt; IPT007N06N -&gt; INA780x -&gt; </w:t>
+      </w:r>
+      <w:r>
+        <w:t>horizontal</w:t>
+      </w:r>
+      <w:r>
+        <w:t xml:space="preserve"> XT60</w:t>
       </w:r>
       <w:r>
         <w:br/>
-        <w:t>|   |-- DRIVE branch 4: gate driver -&gt; IPT007N06N -&gt; INA780x -&gt; vertical XT60</w:t>
+        <w:t xml:space="preserve">|   |-- DRIVE branch 4: gate driver -&gt; IPT007N06N -&gt; INA780x -&gt; </w:t>
+      </w:r>
+      <w:r>
+        <w:t>horizontal</w:t>
+      </w:r>
+      <w:r>
+        <w:t xml:space="preserve"> XT60</w:t>
       </w:r>
       <w:r>
         <w:br/>
-        <w:t>|   |-- DRIVE branch 5: gate driver -&gt; IPT007N06N -&gt; INA780x -&gt; vertical XT60</w:t>
+        <w:t xml:space="preserve">|   |-- DRIVE branch 5: gate driver -&gt; IPT007N06N -&gt; INA780x -&gt; </w:t>
+      </w:r>
+      <w:r>
+        <w:t>horizontal</w:t>
+      </w:r>
+      <w:r>
+        <w:t xml:space="preserve"> XT60</w:t>
       </w:r>
       <w:r>
         <w:br/>
-        <w:t>|   `-- DRIVE branch 6: gate driver -&gt; IPT007N06N -&gt; INA780x -&gt; vertical XT60</w:t>
+        <w:t xml:space="preserve">|   `-- DRIVE branch 6: gate driver -&gt; IPT007N06N -&gt; INA780x -&gt; </w:t>
+      </w:r>
+      <w:r>
+        <w:t>horizontal</w:t>
+      </w:r>
+      <w:r>
+        <w:t xml:space="preserve"> XT60</w:t>
       </w:r>
       <w:r>
         <w:br/>
@@ -1218,7 +1375,15 @@
         <w:spacing w:after="60"/>
       </w:pPr>
       <w:r>
-        <w:t>For each branch x = 1..6:</w:t>
+        <w:t xml:space="preserve">For each branch x = </w:t>
+      </w:r>
+      <w:proofErr w:type="gramStart"/>
+      <w:r>
+        <w:t>1..</w:t>
+      </w:r>
+      <w:proofErr w:type="gramEnd"/>
+      <w:r>
+        <w:t>6:</w:t>
       </w:r>
       <w:r>
         <w:br/>
@@ -1275,15 +1440,28 @@
         <w:spacing w:after="60"/>
       </w:pPr>
       <w:r>
-        <w:t>For each branch x = 1..6:</w:t>
+        <w:t xml:space="preserve">For each branch x = </w:t>
+      </w:r>
+      <w:proofErr w:type="gramStart"/>
+      <w:r>
+        <w:t>1..</w:t>
+      </w:r>
+      <w:proofErr w:type="gramEnd"/>
+      <w:r>
+        <w:t>6:</w:t>
       </w:r>
       <w:r>
         <w:br/>
       </w:r>
       <w:r>
         <w:br/>
-        <w:t>RP2350 DRIVE_EN_x</w:t>
-      </w:r>
+        <w:t xml:space="preserve">RP2350 </w:t>
+      </w:r>
+      <w:proofErr w:type="spellStart"/>
+      <w:r>
+        <w:t>DRIVE_EN_x</w:t>
+      </w:r>
+      <w:proofErr w:type="spellEnd"/>
       <w:r>
         <w:br/>
         <w:t xml:space="preserve">   |</w:t>
@@ -1448,33 +1626,40 @@
         <w:spacing w:after="60"/>
       </w:pPr>
       <w:r>
-        <w:rPr/>
         <w:t>E-stop screw terminal:</w:t>
+      </w:r>
+      <w:r>
         <w:br/>
         <w:t>3.3 V pull-up / bias network</w:t>
+      </w:r>
+      <w:r>
         <w:br/>
         <w:t xml:space="preserve">   |</w:t>
+      </w:r>
+      <w:r>
         <w:br/>
         <w:t>E_STOP_NODE ---- external 2-prong E-stop switch (normally open) ---- 3.3 V logic rail when actively held closed</w:t>
+      </w:r>
+      <w:r>
         <w:br/>
         <w:t xml:space="preserve">   |</w:t>
+      </w:r>
+      <w:r>
         <w:br/>
         <w:t>E_STOP_OK signal</w:t>
+      </w:r>
+      <w:r>
         <w:br/>
         <w:t xml:space="preserve">   |-- to RP2350 E_STOP_STATUS input</w:t>
+      </w:r>
+      <w:r>
         <w:br/>
         <w:t xml:space="preserve">   |-- to all SN74LVC08 E-stop gate inputs</w:t>
+      </w:r>
+      <w:r>
         <w:br/>
         <w:t xml:space="preserve">   `-- to full-system disconnect logic, relay, or approved competition disconnect circuit</w:t>
       </w:r>
-      <w:r/>
-      <w:r/>
-      <w:r/>
-      <w:r/>
-      <w:r/>
-      <w:r/>
-      <w:r/>
-      <w:r/>
     </w:p>
     <w:p>
       <w:pPr>
@@ -1771,7 +1956,21 @@
               <w:rPr>
                 <w:sz w:val="16"/>
               </w:rPr>
-              <w:t>Optional future variant with 48 GPIO. Not baseline; LCSC currently shows not available.</w:t>
+              <w:t xml:space="preserve">Optional future variant with 48 GPIO. Not baseline; LCSC currently shows </w:t>
+            </w:r>
+            <w:proofErr w:type="gramStart"/>
+            <w:r>
+              <w:rPr>
+                <w:sz w:val="16"/>
+              </w:rPr>
+              <w:t>not</w:t>
+            </w:r>
+            <w:proofErr w:type="gramEnd"/>
+            <w:r>
+              <w:rPr>
+                <w:sz w:val="16"/>
+              </w:rPr>
+              <w:t xml:space="preserve"> available.</w:t>
             </w:r>
           </w:p>
         </w:tc>
@@ -2020,7 +2219,21 @@
               <w:rPr>
                 <w:sz w:val="16"/>
               </w:rPr>
-              <w:t>Not required: USB2 carries data only (no VBUS power delivery to a load), and D+/D- are already current-limited by 27ohm series resistors R7/R8. Decision confirmed 2026-08-07; USBLC6-2SC6 removed from baseline.</w:t>
+              <w:t xml:space="preserve">Not required: USB2 carries data only (no VBUS power delivery to a load), and D+/D- are already </w:t>
+            </w:r>
+            <w:proofErr w:type="gramStart"/>
+            <w:r>
+              <w:rPr>
+                <w:sz w:val="16"/>
+              </w:rPr>
+              <w:t>current-limited</w:t>
+            </w:r>
+            <w:proofErr w:type="gramEnd"/>
+            <w:r>
+              <w:rPr>
+                <w:sz w:val="16"/>
+              </w:rPr>
+              <w:t xml:space="preserve"> by 27ohm series resistors R7/R8. Decision confirmed 2026-08-07; USBLC6-2SC6 removed from baseline.</w:t>
             </w:r>
           </w:p>
         </w:tc>
@@ -2186,14 +2399,14 @@
               <w:rPr>
                 <w:sz w:val="16"/>
               </w:rPr>
-              <w:t xml:space="preserve">Buffers all RP2350-controlled enable outputs. 8 total buffer channels; exactly covers DRIVE1-6 + ARM + SCIENCE with zero spare </w:t>
+              <w:t>Buffers all RP2350-controlled enable outputs. 8 total buffer channels; exactly covers DRIVE1-</w:t>
             </w:r>
             <w:r>
               <w:rPr>
                 <w:sz w:val="16"/>
               </w:rPr>
               <w:lastRenderedPageBreak/>
-              <w:t>(AUX_22_EN/SPARE_EN removed from baseline).</w:t>
+              <w:t>6 + ARM + SCIENCE with zero spare (AUX_22_EN/SPARE_EN removed from baseline).</w:t>
             </w:r>
           </w:p>
         </w:tc>
@@ -2414,7 +2627,35 @@
                 <w:sz w:val="16"/>
               </w:rPr>
               <w:br/>
-              <w:t>Since this mosfet after about ~8v reaches its “peak” current capabilities, you can set the vcc of this to be on the 12v rail output</w:t>
+              <w:t xml:space="preserve">Since this </w:t>
+            </w:r>
+            <w:proofErr w:type="spellStart"/>
+            <w:r>
+              <w:rPr>
+                <w:sz w:val="16"/>
+              </w:rPr>
+              <w:t>mosfet</w:t>
+            </w:r>
+            <w:proofErr w:type="spellEnd"/>
+            <w:r>
+              <w:rPr>
+                <w:sz w:val="16"/>
+              </w:rPr>
+              <w:t xml:space="preserve"> after about ~8v reaches its “peak” current capabilities, you can set the </w:t>
+            </w:r>
+            <w:proofErr w:type="spellStart"/>
+            <w:r>
+              <w:rPr>
+                <w:sz w:val="16"/>
+              </w:rPr>
+              <w:t>vcc</w:t>
+            </w:r>
+            <w:proofErr w:type="spellEnd"/>
+            <w:r>
+              <w:rPr>
+                <w:sz w:val="16"/>
+              </w:rPr>
+              <w:t xml:space="preserve"> of this to be on the 12v rail output</w:t>
             </w:r>
           </w:p>
         </w:tc>
@@ -3134,7 +3375,14 @@
               <w:rPr>
                 <w:sz w:val="16"/>
               </w:rPr>
-              <w:t>Six drivetrain outputs, ARM output (2x), SCIENCE output (1x), plus Jetson power, POE switch, network switch, and aux outputs (network switch and aux share one 12V rail but have separate physical XT60 pads) -- moved from KF301 screw terminals.</w:t>
+              <w:t xml:space="preserve">Six drivetrain outputs, ARM output (2x), SCIENCE output (1x), plus Jetson power, POE switch, network switch, and aux outputs (network switch and aux share one 12V rail but </w:t>
+            </w:r>
+            <w:r>
+              <w:rPr>
+                <w:sz w:val="16"/>
+              </w:rPr>
+              <w:lastRenderedPageBreak/>
+              <w:t>have separate physical XT60 pads) -- moved from KF301 screw terminals.</w:t>
             </w:r>
           </w:p>
         </w:tc>
@@ -3152,6 +3400,7 @@
               <w:rPr>
                 <w:sz w:val="16"/>
               </w:rPr>
+              <w:lastRenderedPageBreak/>
               <w:t>E-stop terminal</w:t>
             </w:r>
           </w:p>
@@ -3223,8 +3472,16 @@
               <w:rPr>
                 <w:sz w:val="16"/>
               </w:rPr>
-              <w:t>Two-pin terminal for pull-to-GND E-stop sw</w:t>
-            </w:r>
+              <w:t xml:space="preserve">Two-pin terminal for pull-to-GND E-stop </w:t>
+            </w:r>
+            <w:proofErr w:type="spellStart"/>
+            <w:r>
+              <w:rPr>
+                <w:sz w:val="16"/>
+              </w:rPr>
+              <w:t>sw</w:t>
+            </w:r>
+            <w:proofErr w:type="spellEnd"/>
           </w:p>
         </w:tc>
       </w:tr>
@@ -3246,7 +3503,6 @@
               <w:rPr>
                 <w:sz w:val="16"/>
               </w:rPr>
-              <w:lastRenderedPageBreak/>
               <w:t>Screw Terminal Block</w:t>
             </w:r>
           </w:p>
@@ -3497,7 +3753,35 @@
               <w:rPr>
                 <w:sz w:val="16"/>
               </w:rPr>
-              <w:t>Ground-protection-network diode (DGND) for the TPS1HA08 cluster, per TI's TPS1HA08-Q1 recommended application circuit (Section 9.1, Ground Protection Network): placed in series between the TPS1HA08 devices' common GND reference and board GND (NOT in series with VBB), so only the eFuses' own quiescent/control current needs blocking during a reverse-battery event, not the full load current. Multiple high-side switches may share one DGND network -- U2/U5/U23 can share a single BAS21. Add RGND (4.7k-ohm typical, size against IGND abs-max rating) in parallel with DGND if any of the three drives an inductive load. NOTE: device GND will be offset from microcontroller GND by the diode's forward drop when current flows -- confirm all EN/DIA_EN/SNS/ST/SEL1/SEL2/LATCH control-pin interfaces to the RP2350 have adequate RPROT-style series resistance (15k-ohm typical per TI) for this offset. NOT YET IMPLEMENTED IN SCHEMATIC as of 2026-08-07 -- new requirement, see Section 12.</w:t>
+              <w:t xml:space="preserve">Ground-protection-network diode (DGND) for the TPS1HA08 cluster, per TI's TPS1HA08-Q1 recommended application circuit (Section 9.1, Ground Protection Network): placed in series between the TPS1HA08 devices' common GND reference and board GND (NOT in series with VBB), so only the </w:t>
+            </w:r>
+            <w:proofErr w:type="spellStart"/>
+            <w:r>
+              <w:rPr>
+                <w:sz w:val="16"/>
+              </w:rPr>
+              <w:t>eFuses</w:t>
+            </w:r>
+            <w:proofErr w:type="spellEnd"/>
+            <w:r>
+              <w:rPr>
+                <w:sz w:val="16"/>
+              </w:rPr>
+              <w:t>' own quiescent/control current needs blocking during a reverse-battery event, not the full load current. Multiple high-side switches may share one DGND network -- U2/U5/U23 can share a single BAS21. Add RGND (4.7k-ohm typical, size against IGND abs-max rating</w:t>
+            </w:r>
+            <w:proofErr w:type="gramStart"/>
+            <w:r>
+              <w:rPr>
+                <w:sz w:val="16"/>
+              </w:rPr>
+              <w:t>) in</w:t>
+            </w:r>
+            <w:proofErr w:type="gramEnd"/>
+            <w:r>
+              <w:rPr>
+                <w:sz w:val="16"/>
+              </w:rPr>
+              <w:t xml:space="preserve"> parallel with DGND if any of the three drives an inductive load. NOTE: device GND will be offset from microcontroller GND by the diode's forward drop when current flows -- confirm all EN/DIA_EN/SNS/ST/SEL1/SEL2/LATCH control-pin interfaces to the RP2350 have adequate RPROT-style series resistance (15k-ohm typical per TI) for this offset. NOT YET IMPLEMENTED IN SCHEMATIC as of 2026-08-07 -- new requirement, see Section 12.</w:t>
             </w:r>
           </w:p>
         </w:tc>
@@ -3532,7 +3816,15 @@
         <w:spacing w:after="60"/>
       </w:pPr>
       <w:r>
-        <w:t>The design shall use onboard TCA4307 I2C buffers.</w:t>
+        <w:t xml:space="preserve">The design shall </w:t>
+      </w:r>
+      <w:proofErr w:type="gramStart"/>
+      <w:r>
+        <w:t>use</w:t>
+      </w:r>
+      <w:proofErr w:type="gramEnd"/>
+      <w:r>
+        <w:t xml:space="preserve"> onboard TCA4307 I2C buffers.</w:t>
       </w:r>
     </w:p>
     <w:p>
@@ -3638,6 +3930,9 @@
       </w:r>
       <w:r>
         <w:br/>
+      </w:r>
+      <w:r>
+        <w:lastRenderedPageBreak/>
         <w:t xml:space="preserve">       `-- INA780x SCIENCE</w:t>
       </w:r>
       <w:r>
@@ -3649,9 +3944,6 @@
       </w:r>
       <w:r>
         <w:br/>
-      </w:r>
-      <w:r>
-        <w:lastRenderedPageBreak/>
         <w:t xml:space="preserve">   `-- TCA4307 buffer: logic/temp segment</w:t>
       </w:r>
       <w:r>
@@ -4501,7 +4793,15 @@
         <w:spacing w:after="60"/>
       </w:pPr>
       <w:r>
-        <w:t>The firmware shall probe all expected addresses at boot and fail safe if any required monitor is missing.</w:t>
+        <w:t xml:space="preserve">The firmware </w:t>
+      </w:r>
+      <w:proofErr w:type="gramStart"/>
+      <w:r>
+        <w:t>shall</w:t>
+      </w:r>
+      <w:proofErr w:type="gramEnd"/>
+      <w:r>
+        <w:t xml:space="preserve"> probe all expected addresses at boot and fail safe if any required monitor is missing.</w:t>
       </w:r>
     </w:p>
     <w:p>
@@ -5252,6 +5552,7 @@
               <w:rPr>
                 <w:sz w:val="16"/>
               </w:rPr>
+              <w:lastRenderedPageBreak/>
               <w:t>GPIO12</w:t>
             </w:r>
           </w:p>
@@ -5370,7 +5671,6 @@
               <w:rPr>
                 <w:sz w:val="16"/>
               </w:rPr>
-              <w:lastRenderedPageBreak/>
               <w:t>GPIO15</w:t>
             </w:r>
           </w:p>
@@ -5919,7 +6219,15 @@
         <w:spacing w:before="160" w:after="80"/>
       </w:pPr>
       <w:r>
-        <w:t>6.3 Buffer and AND Gate Channel Use</w:t>
+        <w:t xml:space="preserve">6.3 Buffer and </w:t>
+      </w:r>
+      <w:proofErr w:type="spellStart"/>
+      <w:r>
+        <w:t>AND</w:t>
+      </w:r>
+      <w:proofErr w:type="spellEnd"/>
+      <w:r>
+        <w:t xml:space="preserve"> Gate Channel Use</w:t>
       </w:r>
     </w:p>
     <w:tbl>
@@ -5995,6 +6303,7 @@
             <w:vAlign w:val="center"/>
           </w:tcPr>
           <w:p>
+            <w:proofErr w:type="gramStart"/>
             <w:r>
               <w:rPr>
                 <w:b/>
@@ -6002,6 +6311,7 @@
               </w:rPr>
               <w:t>Final destination</w:t>
             </w:r>
+            <w:proofErr w:type="gramEnd"/>
           </w:p>
         </w:tc>
       </w:tr>
@@ -6500,7 +6810,15 @@
         <w:spacing w:after="60"/>
       </w:pPr>
       <w:r>
-        <w:t>All final enable lines shall have local pulldowns so power stages default OFF when logic is unpowered.</w:t>
+        <w:t xml:space="preserve">All final enable lines shall have local </w:t>
+      </w:r>
+      <w:proofErr w:type="gramStart"/>
+      <w:r>
+        <w:t>pulldowns</w:t>
+      </w:r>
+      <w:proofErr w:type="gramEnd"/>
+      <w:r>
+        <w:t xml:space="preserve"> so power stages default OFF when logic is unpowered.</w:t>
       </w:r>
     </w:p>
     <w:p>
@@ -6703,7 +7021,19 @@
               <w:rPr>
                 <w:sz w:val="16"/>
               </w:rPr>
-              <w:t>Use vertical through-hole XT60 for drivetrain outputs and high-current ARM/SCIENCE outputs unless explicitly approved otherwise.</w:t>
+              <w:t xml:space="preserve">Use </w:t>
+            </w:r>
+            <w:r>
+              <w:rPr>
+                <w:sz w:val="16"/>
+              </w:rPr>
+              <w:t>horizontal</w:t>
+            </w:r>
+            <w:r>
+              <w:rPr>
+                <w:sz w:val="16"/>
+              </w:rPr>
+              <w:t xml:space="preserve"> through-hole XT60 for drivetrain outputs and high-current ARM/SCIENCE outputs unless explicitly approved otherwise.</w:t>
             </w:r>
           </w:p>
         </w:tc>
@@ -6782,8 +7112,13 @@
         <w:spacing w:before="160" w:after="80"/>
       </w:pPr>
       <w:r>
-        <w:t>7.2 Recommended Stackup</w:t>
-      </w:r>
+        <w:t xml:space="preserve">7.2 Recommended </w:t>
+      </w:r>
+      <w:proofErr w:type="spellStart"/>
+      <w:r>
+        <w:t>Stackup</w:t>
+      </w:r>
+      <w:proofErr w:type="spellEnd"/>
     </w:p>
     <w:p>
       <w:pPr>
@@ -6803,6 +7138,9 @@
       </w:r>
       <w:r>
         <w:br/>
+      </w:r>
+      <w:r>
+        <w:lastRenderedPageBreak/>
         <w:t>L3: power planes / high-current distribution zones / 3.3 V where needed</w:t>
       </w:r>
       <w:r>
@@ -6814,9 +7152,6 @@
       </w:r>
       <w:r>
         <w:br/>
-      </w:r>
-      <w:r>
-        <w:lastRenderedPageBreak/>
         <w:t>6-layer preferred:</w:t>
       </w:r>
       <w:r>
@@ -7083,7 +7418,21 @@
               <w:rPr>
                 <w:sz w:val="16"/>
               </w:rPr>
-              <w:t>Short, direct, local to MOSFET. LTC7001 TGDN ties directly to gate (fast turn-off); TGUP feeds gate through a 200k-ohm resistor to control turn-on inrush -- this is ADI's recommended LTC7001 topology, not a generic 5-10 ohm gate resistor. No external gate-source pulldown required (LTC7001 INP has an internal 1M-ohm pulldown to GND holding TGDN toward TS); residual risk if LTC7001 itself loses VCC entirely is tracked in Section 12.</w:t>
+              <w:t xml:space="preserve">Short, direct, local to MOSFET. LTC7001 TGDN ties directly to gate (fast turn-off); TGUP feeds gate through a 200k-ohm resistor to control turn-on inrush -- this is ADI's recommended LTC7001 topology, not a generic </w:t>
+            </w:r>
+            <w:proofErr w:type="gramStart"/>
+            <w:r>
+              <w:rPr>
+                <w:sz w:val="16"/>
+              </w:rPr>
+              <w:t>5-10 ohm</w:t>
+            </w:r>
+            <w:proofErr w:type="gramEnd"/>
+            <w:r>
+              <w:rPr>
+                <w:sz w:val="16"/>
+              </w:rPr>
+              <w:t xml:space="preserve"> gate resistor. No external gate-source pulldown required (LTC7001 INP has an internal 1M-ohm pulldown to GND holding TGDN toward TS); residual risk if LTC7001 itself loses VCC entirely is tracked in Section 12.</w:t>
             </w:r>
           </w:p>
         </w:tc>
@@ -7243,7 +7592,15 @@
         <w:spacing w:after="60"/>
       </w:pPr>
       <w:r>
-        <w:t>Firmware shall support Zephyr on RP2350A or a custom board target derived from Raspberry Pi Pico 2 / RP2350A support.</w:t>
+        <w:t xml:space="preserve">Firmware shall support Zephyr on </w:t>
+      </w:r>
+      <w:proofErr w:type="gramStart"/>
+      <w:r>
+        <w:t>RP2350A</w:t>
+      </w:r>
+      <w:proofErr w:type="gramEnd"/>
+      <w:r>
+        <w:t xml:space="preserve"> or a custom board target derived from Raspberry Pi Pico 2 / RP2350A support.</w:t>
       </w:r>
     </w:p>
     <w:p>
@@ -7270,7 +7627,15 @@
         <w:spacing w:after="60"/>
       </w:pPr>
       <w:r>
-        <w:t>Firmware shall read E_STOP_STATUS before enabling any controlled rail.</w:t>
+        <w:t xml:space="preserve">Firmware </w:t>
+      </w:r>
+      <w:proofErr w:type="gramStart"/>
+      <w:r>
+        <w:t>shall</w:t>
+      </w:r>
+      <w:proofErr w:type="gramEnd"/>
+      <w:r>
+        <w:t xml:space="preserve"> read E_STOP_STATUS before enabling any controlled rail.</w:t>
       </w:r>
     </w:p>
     <w:p>
@@ -7549,7 +7914,15 @@
         <w:spacing w:after="60"/>
       </w:pPr>
       <w:r>
-        <w:t>Run GPIO self-test into buffers and AND gates with no power stages populated if possible.</w:t>
+        <w:t xml:space="preserve">Run GPIO self-test into buffers and </w:t>
+      </w:r>
+      <w:proofErr w:type="spellStart"/>
+      <w:r>
+        <w:t>AND</w:t>
+      </w:r>
+      <w:proofErr w:type="spellEnd"/>
+      <w:r>
+        <w:t xml:space="preserve"> gates with no power stages populated if possible.</w:t>
       </w:r>
     </w:p>
     <w:p>
@@ -7693,7 +8066,15 @@
         <w:spacing w:after="60"/>
       </w:pPr>
       <w:r>
-        <w:t>Every symbol exists in KiCad and matches the datasheet pinout.</w:t>
+        <w:t xml:space="preserve">Every symbol exists in </w:t>
+      </w:r>
+      <w:proofErr w:type="spellStart"/>
+      <w:r>
+        <w:t>KiCad</w:t>
+      </w:r>
+      <w:proofErr w:type="spellEnd"/>
+      <w:r>
+        <w:t xml:space="preserve"> and matches the datasheet pinout.</w:t>
       </w:r>
     </w:p>
     <w:p>
@@ -7702,7 +8083,15 @@
         <w:spacing w:after="60"/>
       </w:pPr>
       <w:r>
-        <w:t>Every footprint exists in KiCad and matches the manufacturer land pattern.</w:t>
+        <w:t xml:space="preserve">Every footprint exists in </w:t>
+      </w:r>
+      <w:proofErr w:type="spellStart"/>
+      <w:r>
+        <w:t>KiCad</w:t>
+      </w:r>
+      <w:proofErr w:type="spellEnd"/>
+      <w:r>
+        <w:t xml:space="preserve"> and matches the manufacturer land pattern.</w:t>
       </w:r>
     </w:p>
     <w:p>
@@ -7864,7 +8253,15 @@
         <w:spacing w:after="60"/>
       </w:pPr>
       <w:r>
-        <w:t>Ground plane is continuous under RP2350, USB, QSPI, crystal, and I2C.</w:t>
+        <w:t xml:space="preserve">Ground </w:t>
+      </w:r>
+      <w:proofErr w:type="gramStart"/>
+      <w:r>
+        <w:t>plane is</w:t>
+      </w:r>
+      <w:proofErr w:type="gramEnd"/>
+      <w:r>
+        <w:t xml:space="preserve"> continuous under RP2350, USB, QSPI, crystal, and I2C.</w:t>
       </w:r>
     </w:p>
     <w:p>
@@ -7937,7 +8334,15 @@
         <w:spacing w:after="60"/>
       </w:pPr>
       <w:r>
-        <w:t>Firmware refuses to enable outputs when E-stop is asserted.</w:t>
+        <w:t xml:space="preserve">Firmware refuses to enable </w:t>
+      </w:r>
+      <w:proofErr w:type="gramStart"/>
+      <w:r>
+        <w:t>outputs</w:t>
+      </w:r>
+      <w:proofErr w:type="gramEnd"/>
+      <w:r>
+        <w:t xml:space="preserve"> when E-stop is asserted.</w:t>
       </w:r>
     </w:p>
     <w:p>
@@ -7964,7 +8369,15 @@
         <w:spacing w:after="60"/>
       </w:pPr>
       <w:r>
-        <w:t>Firmware implements high_power disable command.</w:t>
+        <w:t xml:space="preserve">Firmware implements </w:t>
+      </w:r>
+      <w:proofErr w:type="spellStart"/>
+      <w:r>
+        <w:t>high_power</w:t>
+      </w:r>
+      <w:proofErr w:type="spellEnd"/>
+      <w:r>
+        <w:t xml:space="preserve"> disable command.</w:t>
       </w:r>
     </w:p>
     <w:p>
@@ -8060,7 +8473,21 @@
               <w:rPr>
                 <w:sz w:val="16"/>
               </w:rPr>
-              <w:t>RESOLVED 2026-08-07. Confirmed normally-open, fail-safe hold-to-enable topology matches intent: status node pulled LOW (outputs off) by default/switch-open, pulled HIGH (outputs allowed) only while switch is actively closed. See Section 2.6.</w:t>
+              <w:t xml:space="preserve">RESOLVED 2026-08-07. Confirmed </w:t>
+            </w:r>
+            <w:proofErr w:type="gramStart"/>
+            <w:r>
+              <w:rPr>
+                <w:sz w:val="16"/>
+              </w:rPr>
+              <w:t>normally-open</w:t>
+            </w:r>
+            <w:proofErr w:type="gramEnd"/>
+            <w:r>
+              <w:rPr>
+                <w:sz w:val="16"/>
+              </w:rPr>
+              <w:t>, fail-safe hold-to-enable topology matches intent: status node pulled LOW (outputs off) by default/switch-open, pulled HIGH (outputs allowed) only while switch is actively closed. See Section 2.6.</w:t>
             </w:r>
           </w:p>
         </w:tc>
@@ -8184,7 +8611,21 @@
               <w:rPr>
                 <w:sz w:val="16"/>
               </w:rPr>
-              <w:t>Compare final controller sheet against Raspberry Pi official minimal design and the Bronco Space Lab BLVLink hardware v2.0 reference design before PCB routing.</w:t>
+              <w:t xml:space="preserve">Compare final controller sheet against Raspberry Pi official minimal design and the Bronco Space Lab </w:t>
+            </w:r>
+            <w:proofErr w:type="spellStart"/>
+            <w:r>
+              <w:rPr>
+                <w:sz w:val="16"/>
+              </w:rPr>
+              <w:t>BLVLink</w:t>
+            </w:r>
+            <w:proofErr w:type="spellEnd"/>
+            <w:r>
+              <w:rPr>
+                <w:sz w:val="16"/>
+              </w:rPr>
+              <w:t xml:space="preserve"> hardware v2.0 reference design before PCB routing.</w:t>
             </w:r>
           </w:p>
         </w:tc>
@@ -8308,7 +8749,21 @@
               <w:rPr>
                 <w:sz w:val="16"/>
               </w:rPr>
-              <w:t>RESOLVED 2026-08-07 for logic power. BAS21 diode + 4.7k RGND implemented in each TPS1HA08's own GND return path (D10/R99-&gt;U2, D11/R100-&gt;U5, D12/R101-&gt;U23), per TI's TPS1HA08-Q1 Section 9.1 application circuit. This topology is specific to eFuses and does not cover the drivetrain/arm/science battery inputs -- see the new open item below.</w:t>
+              <w:t xml:space="preserve">RESOLVED 2026-08-07 for logic power. BAS21 diode + 4.7k RGND implemented in each TPS1HA08's own GND return path (D10/R99-&gt;U2, D11/R100-&gt;U5, D12/R101-&gt;U23), per TI's TPS1HA08-Q1 Section 9.1 application circuit. This topology is specific to </w:t>
+            </w:r>
+            <w:proofErr w:type="spellStart"/>
+            <w:r>
+              <w:rPr>
+                <w:sz w:val="16"/>
+              </w:rPr>
+              <w:t>eFuses</w:t>
+            </w:r>
+            <w:proofErr w:type="spellEnd"/>
+            <w:r>
+              <w:rPr>
+                <w:sz w:val="16"/>
+              </w:rPr>
+              <w:t xml:space="preserve"> and does not cover the drivetrain/arm/science battery inputs -- see the new open item below.</w:t>
             </w:r>
           </w:p>
         </w:tc>
@@ -8367,7 +8822,15 @@
           </w:tcPr>
           <w:p>
             <w:r>
-              <w:t>Drive/Arm/Science wont have RCP.</w:t>
+              <w:t xml:space="preserve">Drive/Arm/Science </w:t>
+            </w:r>
+            <w:proofErr w:type="gramStart"/>
+            <w:r>
+              <w:t>wont</w:t>
+            </w:r>
+            <w:proofErr w:type="gramEnd"/>
+            <w:r>
+              <w:t xml:space="preserve"> have RCP.</w:t>
             </w:r>
           </w:p>
         </w:tc>
@@ -8606,7 +9069,23 @@
                   <w:color w:val="0563C1"/>
                   <w:u w:val="single"/>
                 </w:rPr>
-                <w:t>Bronco Space Lab BLVLink hardware v2.0 GitHub repository</w:t>
+                <w:t xml:space="preserve">Bronco Space Lab </w:t>
+              </w:r>
+              <w:proofErr w:type="spellStart"/>
+              <w:r>
+                <w:rPr>
+                  <w:color w:val="0563C1"/>
+                  <w:u w:val="single"/>
+                </w:rPr>
+                <w:t>BLVLink</w:t>
+              </w:r>
+              <w:proofErr w:type="spellEnd"/>
+              <w:r>
+                <w:rPr>
+                  <w:color w:val="0563C1"/>
+                  <w:u w:val="single"/>
+                </w:rPr>
+                <w:t xml:space="preserve"> hardware v2.0 GitHub repository</w:t>
               </w:r>
             </w:hyperlink>
           </w:p>
@@ -8620,7 +9099,21 @@
               <w:rPr>
                 <w:sz w:val="16"/>
               </w:rPr>
-              <w:t>RP2350 reference design cross-check. Use this repository to compare the custom controller sheet against known RP2350 support circuitry, including MCU schematic structure, USB, flash, crystal, SWD, BOOTSEL/RUN, and KiCad project organization before PCB routing.</w:t>
+              <w:t xml:space="preserve">RP2350 reference design cross-check. Use this repository to compare the custom controller sheet against known RP2350 support circuitry, including MCU schematic structure, USB, flash, crystal, SWD, BOOTSEL/RUN, and </w:t>
+            </w:r>
+            <w:proofErr w:type="spellStart"/>
+            <w:r>
+              <w:rPr>
+                <w:sz w:val="16"/>
+              </w:rPr>
+              <w:t>KiCad</w:t>
+            </w:r>
+            <w:proofErr w:type="spellEnd"/>
+            <w:r>
+              <w:rPr>
+                <w:sz w:val="16"/>
+              </w:rPr>
+              <w:t xml:space="preserve"> project organization before PCB routing.</w:t>
             </w:r>
           </w:p>
         </w:tc>
@@ -8714,7 +9207,21 @@
               <w:rPr>
                 <w:sz w:val="16"/>
               </w:rPr>
-              <w:t>MOSFET voltage, package, RDS(on), current class, gate charge.</w:t>
+              <w:t xml:space="preserve">MOSFET voltage, package, </w:t>
+            </w:r>
+            <w:proofErr w:type="gramStart"/>
+            <w:r>
+              <w:rPr>
+                <w:sz w:val="16"/>
+              </w:rPr>
+              <w:t>RDS(</w:t>
+            </w:r>
+            <w:proofErr w:type="gramEnd"/>
+            <w:r>
+              <w:rPr>
+                <w:sz w:val="16"/>
+              </w:rPr>
+              <w:t>on), current class, gate charge.</w:t>
             </w:r>
           </w:p>
         </w:tc>
@@ -8807,7 +9314,21 @@
               <w:rPr>
                 <w:sz w:val="16"/>
               </w:rPr>
-              <w:t>I2C buffer, bus recovery, hot-swap/buffering behavior.</w:t>
+              <w:t xml:space="preserve">I2C buffer, bus recovery, </w:t>
+            </w:r>
+            <w:proofErr w:type="gramStart"/>
+            <w:r>
+              <w:rPr>
+                <w:sz w:val="16"/>
+              </w:rPr>
+              <w:t>hot-swap</w:t>
+            </w:r>
+            <w:proofErr w:type="gramEnd"/>
+            <w:r>
+              <w:rPr>
+                <w:sz w:val="16"/>
+              </w:rPr>
+              <w:t>/buffering behavior.</w:t>
             </w:r>
           </w:p>
         </w:tc>
@@ -8852,11 +9373,19 @@
             <w:tcW w:w="5256" w:type="dxa"/>
           </w:tcPr>
           <w:p>
-            <w:r>
-              <w:rPr>
-                <w:sz w:val="16"/>
-              </w:rPr>
-              <w:t>Abracon ABM8-272-T3 listing</w:t>
+            <w:proofErr w:type="spellStart"/>
+            <w:r>
+              <w:rPr>
+                <w:sz w:val="16"/>
+              </w:rPr>
+              <w:t>Abracon</w:t>
+            </w:r>
+            <w:proofErr w:type="spellEnd"/>
+            <w:r>
+              <w:rPr>
+                <w:sz w:val="16"/>
+              </w:rPr>
+              <w:t xml:space="preserve"> ABM8-272-T3 listing</w:t>
             </w:r>
           </w:p>
         </w:tc>
@@ -8900,7 +9429,35 @@
               <w:rPr>
                 <w:sz w:val="16"/>
               </w:rPr>
-              <w:t>Smart high-side eFuse ahead of each LT8612 buck input. Ground-protection-network application circuit (Section 9.1) is the basis for the BAS21 reverse-battery-protection requirement.</w:t>
+              <w:t xml:space="preserve">Smart </w:t>
+            </w:r>
+            <w:proofErr w:type="gramStart"/>
+            <w:r>
+              <w:rPr>
+                <w:sz w:val="16"/>
+              </w:rPr>
+              <w:t>high-side</w:t>
+            </w:r>
+            <w:proofErr w:type="gramEnd"/>
+            <w:r>
+              <w:rPr>
+                <w:sz w:val="16"/>
+              </w:rPr>
+              <w:t xml:space="preserve"> </w:t>
+            </w:r>
+            <w:proofErr w:type="spellStart"/>
+            <w:r>
+              <w:rPr>
+                <w:sz w:val="16"/>
+              </w:rPr>
+              <w:t>eFuse</w:t>
+            </w:r>
+            <w:proofErr w:type="spellEnd"/>
+            <w:r>
+              <w:rPr>
+                <w:sz w:val="16"/>
+              </w:rPr>
+              <w:t xml:space="preserve"> ahead of each LT8612 buck input. Ground-protection-network application circuit (Section 9.1) is the basis for the BAS21 reverse-battery-protection requirement.</w:t>
             </w:r>
           </w:p>
         </w:tc>
@@ -8914,11 +9471,19 @@
             <w:tcW w:w="4629" w:type="dxa"/>
           </w:tcPr>
           <w:p>
-            <w:r>
-              <w:rPr>
-                <w:sz w:val="16"/>
-              </w:rPr>
-              <w:t>Nexperia BAS21 datasheet</w:t>
+            <w:proofErr w:type="spellStart"/>
+            <w:r>
+              <w:rPr>
+                <w:sz w:val="16"/>
+              </w:rPr>
+              <w:t>Nexperia</w:t>
+            </w:r>
+            <w:proofErr w:type="spellEnd"/>
+            <w:r>
+              <w:rPr>
+                <w:sz w:val="16"/>
+              </w:rPr>
+              <w:t xml:space="preserve"> BAS21 datasheet</w:t>
             </w:r>
           </w:p>
         </w:tc>

</xml_diff>

<commit_message>
Updated Arm/Science rails to be 22.2V not 14.4V. this was a wrong architectural decision that needed updating.
</commit_message>
<xml_diff>
--- a/BILLEE_Rover_Control_Module_V1/PDB_Engineering_Requirements_and_Design_Guide_Rev_H.docx
+++ b/BILLEE_Rover_Control_Module_V1/PDB_Engineering_Requirements_and_Design_Guide_Rev_H.docx
@@ -559,7 +559,25 @@
               <w:rPr>
                 <w:sz w:val="16"/>
               </w:rPr>
-              <w:t>14.4 V / 4S LiPo</w:t>
+              <w:t>22.2</w:t>
+            </w:r>
+            <w:r>
+              <w:rPr>
+                <w:sz w:val="16"/>
+              </w:rPr>
+              <w:t xml:space="preserve"> V / </w:t>
+            </w:r>
+            <w:r>
+              <w:rPr>
+                <w:sz w:val="16"/>
+              </w:rPr>
+              <w:t>6</w:t>
+            </w:r>
+            <w:r>
+              <w:rPr>
+                <w:sz w:val="16"/>
+              </w:rPr>
+              <w:t>S LiPo</w:t>
             </w:r>
           </w:p>
         </w:tc>
@@ -1154,7 +1172,25 @@
       </w:r>
       <w:r>
         <w:br/>
-        <w:t xml:space="preserve">`-- 14.4 V ARM/SCIENCE INPUT (4S LiPo, </w:t>
+        <w:t xml:space="preserve">`-- </w:t>
+      </w:r>
+      <w:r>
+        <w:t>22</w:t>
+      </w:r>
+      <w:r>
+        <w:t>.</w:t>
+      </w:r>
+      <w:r>
+        <w:t>2</w:t>
+      </w:r>
+      <w:r>
+        <w:t xml:space="preserve"> V ARM/SCIENCE INPUT (</w:t>
+      </w:r>
+      <w:r>
+        <w:t>6</w:t>
+      </w:r>
+      <w:r>
+        <w:t xml:space="preserve">S LiPo, </w:t>
       </w:r>
       <w:r>
         <w:t>2x</w:t>
@@ -1338,7 +1374,16 @@
         <w:spacing w:after="60"/>
       </w:pPr>
       <w:r>
-        <w:t>14.4 V ARM/SCIENCE INPUT</w:t>
+        <w:t>22</w:t>
+      </w:r>
+      <w:r>
+        <w:t>.</w:t>
+      </w:r>
+      <w:r>
+        <w:t>2</w:t>
+      </w:r>
+      <w:r>
+        <w:t xml:space="preserve"> V ARM/SCIENCE INPUT</w:t>
       </w:r>
       <w:r>
         <w:br/>

</xml_diff>